<commit_message>
Book 1 bibliography insert: edition details for Strong, Thayer, Vine, Chafer, Scofield, Bruce
Co-Authored-By: Claude Sonnet 5.5 <noreply@anthropic.com>
Claude-Session: https://claude.ai/code/session_01BbCk2dKJvxDH6ki3CFHEXN
</commit_message>
<xml_diff>
--- a/build-tools/books/full-framework/Selected_Bibliography_Insert_Full_Framework.docx
+++ b/build-tools/books/full-framework/Selected_Bibliography_Insert_Full_Framework.docx
@@ -174,13 +174,13 @@
         <w:rPr>
           <w:i/>
         </w:rPr>
-        <w:t>Strong’s Exhaustive Concordance of the Bible</w:t>
+        <w:t>The Exhaustive Concordance of the Bible</w:t>
       </w:r>
       <w:r>
         <w:rPr>
           <w:i w:val="0"/>
         </w:rPr>
-        <w:t>. Nashville: Abingdon Press.</w:t>
+        <w:t>. Nashville: Abingdon Press, 1890.</w:t>
       </w:r>
     </w:p>
     <w:p>
@@ -192,19 +192,19 @@
         <w:rPr>
           <w:i w:val="0"/>
         </w:rPr>
-        <w:t xml:space="preserve">Thayer, Joseph H. </w:t>
+        <w:t xml:space="preserve">Thayer, Joseph Henry. </w:t>
       </w:r>
       <w:r>
         <w:rPr>
           <w:i/>
         </w:rPr>
-        <w:t>Greek-English Lexicon of the New Testament</w:t>
+        <w:t>A Greek-English Lexicon of the New Testament</w:t>
       </w:r>
       <w:r>
         <w:rPr>
           <w:i w:val="0"/>
         </w:rPr>
-        <w:t>. Peabody, MA: Hendrickson Publishers.</w:t>
+        <w:t>. New York: American Book Company, 1889.</w:t>
       </w:r>
     </w:p>
     <w:p>
@@ -222,13 +222,13 @@
         <w:rPr>
           <w:i/>
         </w:rPr>
-        <w:t>Vine’s Expository Dictionary of Old and New Testament Words</w:t>
+        <w:t>Vine’s Expository Dictionary of New Testament Words</w:t>
       </w:r>
       <w:r>
         <w:rPr>
           <w:i w:val="0"/>
         </w:rPr>
-        <w:t>. Nashville: Thomas Nelson.</w:t>
+        <w:t>. London: Oliphants, 1940.</w:t>
       </w:r>
     </w:p>
     <w:p>
@@ -313,7 +313,7 @@
         <w:rPr>
           <w:i w:val="0"/>
         </w:rPr>
-        <w:t>. Dallas: Dallas Seminary Press.</w:t>
+        <w:t>. 8 vols. Dallas: Dallas Seminary Press, 1947–1948.</w:t>
       </w:r>
     </w:p>
     <w:p>
@@ -355,13 +355,13 @@
         <w:rPr>
           <w:i/>
         </w:rPr>
-        <w:t>Scofield Reference Bible</w:t>
+        <w:t>The Scofield Reference Bible</w:t>
       </w:r>
       <w:r>
         <w:rPr>
           <w:i w:val="0"/>
         </w:rPr>
-        <w:t>. New York: Oxford University Press.</w:t>
+        <w:t>. New York: Oxford University Press, 1909.</w:t>
       </w:r>
     </w:p>
     <w:p>
@@ -446,7 +446,7 @@
         <w:rPr>
           <w:i w:val="0"/>
         </w:rPr>
-        <w:t>. Grand Rapids: Eerdmans.</w:t>
+        <w:t>. Grand Rapids: Eerdmans, 1954.</w:t>
       </w:r>
     </w:p>
     <w:p>
@@ -807,6 +807,7 @@
       <w:pgMar w:top="1296" w:right="1152" w:bottom="1296" w:left="1152" w:header="720" w:footer="720" w:gutter="0"/>
       <w:cols w:space="720"/>
       <w:docGrid w:linePitch="360"/>
+      <w:pgNumType w:start="231"/>
     </w:sectPr>
   </w:body>
 </w:document>

</xml_diff>

<commit_message>
Book 1 bibliography insert: NLT only (KJV entry removed)
Co-Authored-By: Claude Sonnet 5.5 <noreply@anthropic.com>
Claude-Session: https://claude.ai/code/session_01BbCk2dKJvxDH6ki3CFHEXN
</commit_message>
<xml_diff>
--- a/build-tools/books/full-framework/Selected_Bibliography_Insert_Full_Framework.docx
+++ b/build-tools/books/full-framework/Selected_Bibliography_Insert_Full_Framework.docx
@@ -35,25 +35,7 @@
           <w:b/>
           <w:sz w:val="23"/>
         </w:rPr>
-        <w:t>Bible Translations</w:t>
-      </w:r>
-    </w:p>
-    <w:p>
-      <w:pPr>
-        <w:spacing w:after="80"/>
-        <w:ind w:left="432" w:hanging="432"/>
-      </w:pPr>
-      <w:r>
-        <w:rPr>
-          <w:i/>
-        </w:rPr>
-        <w:t>The Holy Bible, King James Version</w:t>
-      </w:r>
-      <w:r>
-        <w:rPr>
-          <w:i w:val="0"/>
-        </w:rPr>
-        <w:t>. Oxford: Oxford University Press, 1769.</w:t>
+        <w:t>Bible Translation</w:t>
       </w:r>
     </w:p>
     <w:p>

</xml_diff>